<commit_message>
Fix docx: remove /scripts/ prefix from URLs
</commit_message>
<xml_diff>
--- a/Migration_HandsOn_Workbook_v2.docx
+++ b/Migration_HandsOn_Workbook_v2.docx
@@ -8685,7 +8685,7 @@
                 <w:sz w:val="19"/>
                 <w:szCs w:val="19"/>
               </w:rPr>
-              <w:t>main/scripts/bootstrap.sh -o bootstrap.sh</w:t>
+              <w:t>main/bootstrap.sh -o bootstrap.sh</w:t>
             </w:r>
           </w:p>
           <w:p>
@@ -29566,7 +29566,7 @@
                 <w:sz w:val="19"/>
                 <w:szCs w:val="19"/>
               </w:rPr>
-              <w:t>curl -fsSL https://raw.githubusercontent.com/jhjwlee/migration-lab-pg/main/scripts/cleanup.sh | bash</w:t>
+              <w:t>curl -fsSL https://raw.githubusercontent.com/jhjwlee/migration-lab-pg/main/cleanup.sh | bash</w:t>
             </w:r>
           </w:p>
         </w:tc>
@@ -39917,7 +39917,7 @@
                 <w:sz w:val="19"/>
                 <w:szCs w:val="19"/>
               </w:rPr>
-              <w:t>curl -fsSL https://raw.githubusercontent.com/jhjwlee/migration-lab-pg/main/scripts/bootstrap.sh -o bootstrap.sh</w:t>
+              <w:t>curl -fsSL https://raw.githubusercontent.com/jhjwlee/migration-lab-pg/main/bootstrap.sh -o bootstrap.sh</w:t>
             </w:r>
           </w:p>
           <w:p>
@@ -40234,7 +40234,7 @@
           <w:szCs w:val="20"/>
           <w:shd w:val="clear" w:color="auto" w:fill="F4F4F4"/>
         </w:rPr>
-        <w:t>curl -fsSL .../scripts/bootstrap.sh -o bootstrap.sh</w:t>
+        <w:t>curl -fsSL .../bootstrap.sh -o bootstrap.sh</w:t>
       </w:r>
     </w:p>
     <w:p>

</xml_diff>